<commit_message>
CAGR2.py added ICT GDP stacked plot of the ICT sector
</commit_message>
<xml_diff>
--- a/Benchmarking/Benchmark List of graphs.docx
+++ b/Benchmarking/Benchmark List of graphs.docx
@@ -15,15 +15,13 @@
           <w:rFonts w:asciiTheme="majorBidi" w:hAnsiTheme="majorBidi" w:cstheme="majorBidi"/>
           <w:sz w:val="24"/>
           <w:szCs w:val="24"/>
-          <w:lang w:val="en-IL"/>
-        </w:rPr>
-      </w:pPr>
-      <w:r>
-        <w:rPr>
-          <w:rFonts w:asciiTheme="majorBidi" w:hAnsiTheme="majorBidi" w:cstheme="majorBidi"/>
-          <w:sz w:val="24"/>
-          <w:szCs w:val="24"/>
-          <w:lang w:val="en-IL"/>
+        </w:rPr>
+      </w:pPr>
+      <w:r>
+        <w:rPr>
+          <w:rFonts w:asciiTheme="majorBidi" w:hAnsiTheme="majorBidi" w:cstheme="majorBidi"/>
+          <w:sz w:val="24"/>
+          <w:szCs w:val="24"/>
         </w:rPr>
         <w:t>List of graphs:</w:t>
       </w:r>
@@ -35,18 +33,16 @@
           <w:rFonts w:asciiTheme="majorBidi" w:hAnsiTheme="majorBidi" w:cstheme="majorBidi"/>
           <w:sz w:val="24"/>
           <w:szCs w:val="24"/>
-          <w:lang w:val="en-IL"/>
-        </w:rPr>
-      </w:pPr>
-    </w:p>
-    <w:p>
-      <w:pPr>
-        <w:spacing w:after="0"/>
-        <w:rPr>
-          <w:rFonts w:asciiTheme="majorBidi" w:hAnsiTheme="majorBidi" w:cstheme="majorBidi"/>
-          <w:sz w:val="24"/>
-          <w:szCs w:val="24"/>
-          <w:lang w:val="en-IL"/>
+        </w:rPr>
+      </w:pPr>
+    </w:p>
+    <w:p>
+      <w:pPr>
+        <w:spacing w:after="0"/>
+        <w:rPr>
+          <w:rFonts w:asciiTheme="majorBidi" w:hAnsiTheme="majorBidi" w:cstheme="majorBidi"/>
+          <w:sz w:val="24"/>
+          <w:szCs w:val="24"/>
         </w:rPr>
       </w:pPr>
     </w:p>
@@ -62,15 +58,13 @@
           <w:rFonts w:asciiTheme="majorBidi" w:hAnsiTheme="majorBidi" w:cstheme="majorBidi"/>
           <w:sz w:val="24"/>
           <w:szCs w:val="24"/>
-          <w:lang w:val="en-IL"/>
-        </w:rPr>
-      </w:pPr>
-      <w:r>
-        <w:rPr>
-          <w:rFonts w:asciiTheme="majorBidi" w:hAnsiTheme="majorBidi" w:cstheme="majorBidi"/>
-          <w:sz w:val="24"/>
-          <w:szCs w:val="24"/>
-          <w:lang w:val="en-IL"/>
+        </w:rPr>
+      </w:pPr>
+      <w:r>
+        <w:rPr>
+          <w:rFonts w:asciiTheme="majorBidi" w:hAnsiTheme="majorBidi" w:cstheme="majorBidi"/>
+          <w:sz w:val="24"/>
+          <w:szCs w:val="24"/>
         </w:rPr>
         <w:t>ICT Sector Total Revenue – 2010 to 2019 CAGR</w:t>
       </w:r>
@@ -136,15 +130,13 @@
           <w:rFonts w:asciiTheme="majorBidi" w:hAnsiTheme="majorBidi" w:cstheme="majorBidi"/>
           <w:sz w:val="24"/>
           <w:szCs w:val="24"/>
-          <w:lang w:val="en-IL"/>
-        </w:rPr>
-      </w:pPr>
-      <w:r>
-        <w:rPr>
-          <w:rFonts w:asciiTheme="majorBidi" w:hAnsiTheme="majorBidi" w:cstheme="majorBidi"/>
-          <w:sz w:val="24"/>
-          <w:szCs w:val="24"/>
-          <w:lang w:val="en-IL"/>
+        </w:rPr>
+      </w:pPr>
+      <w:r>
+        <w:rPr>
+          <w:rFonts w:asciiTheme="majorBidi" w:hAnsiTheme="majorBidi" w:cstheme="majorBidi"/>
+          <w:sz w:val="24"/>
+          <w:szCs w:val="24"/>
         </w:rPr>
         <w:t>Average ICT Sector Share in Total National Output (2010–2019)</w:t>
       </w:r>
@@ -168,7 +160,6 @@
           <w:rFonts w:asciiTheme="majorBidi" w:hAnsiTheme="majorBidi" w:cstheme="majorBidi"/>
           <w:sz w:val="24"/>
           <w:szCs w:val="24"/>
-          <w:lang w:val="en-IL"/>
         </w:rPr>
       </w:pPr>
     </w:p>
@@ -184,15 +175,13 @@
           <w:rFonts w:asciiTheme="majorBidi" w:hAnsiTheme="majorBidi" w:cstheme="majorBidi"/>
           <w:sz w:val="24"/>
           <w:szCs w:val="24"/>
-          <w:lang w:val="en-IL"/>
-        </w:rPr>
-      </w:pPr>
-      <w:r>
-        <w:rPr>
-          <w:rFonts w:asciiTheme="majorBidi" w:hAnsiTheme="majorBidi" w:cstheme="majorBidi"/>
-          <w:sz w:val="24"/>
-          <w:szCs w:val="24"/>
-          <w:lang w:val="en-IL"/>
+        </w:rPr>
+      </w:pPr>
+      <w:r>
+        <w:rPr>
+          <w:rFonts w:asciiTheme="majorBidi" w:hAnsiTheme="majorBidi" w:cstheme="majorBidi"/>
+          <w:sz w:val="24"/>
+          <w:szCs w:val="24"/>
         </w:rPr>
         <w:t>Comparison of ICT Share in National GDP</w:t>
       </w:r>
@@ -332,15 +321,13 @@
           <w:rFonts w:asciiTheme="majorBidi" w:hAnsiTheme="majorBidi" w:cstheme="majorBidi"/>
           <w:sz w:val="24"/>
           <w:szCs w:val="24"/>
-          <w:lang w:val="en-IL"/>
-        </w:rPr>
-      </w:pPr>
-      <w:r>
-        <w:rPr>
-          <w:rFonts w:asciiTheme="majorBidi" w:hAnsiTheme="majorBidi" w:cstheme="majorBidi"/>
-          <w:sz w:val="24"/>
-          <w:szCs w:val="24"/>
-          <w:lang w:val="en-IL"/>
+        </w:rPr>
+      </w:pPr>
+      <w:r>
+        <w:rPr>
+          <w:rFonts w:asciiTheme="majorBidi" w:hAnsiTheme="majorBidi" w:cstheme="majorBidi"/>
+          <w:sz w:val="24"/>
+          <w:szCs w:val="24"/>
         </w:rPr>
         <w:t>ICT GDP Overall Impact - % of National GDP (2019)</w:t>
       </w:r>
@@ -353,15 +340,13 @@
           <w:rFonts w:asciiTheme="majorBidi" w:hAnsiTheme="majorBidi" w:cstheme="majorBidi"/>
           <w:sz w:val="24"/>
           <w:szCs w:val="24"/>
-          <w:lang w:val="en-IL"/>
-        </w:rPr>
-      </w:pPr>
-      <w:r>
-        <w:rPr>
-          <w:rFonts w:asciiTheme="majorBidi" w:hAnsiTheme="majorBidi" w:cstheme="majorBidi"/>
-          <w:sz w:val="24"/>
-          <w:szCs w:val="24"/>
-          <w:lang w:val="en-IL"/>
+        </w:rPr>
+      </w:pPr>
+      <w:r>
+        <w:rPr>
+          <w:rFonts w:asciiTheme="majorBidi" w:hAnsiTheme="majorBidi" w:cstheme="majorBidi"/>
+          <w:sz w:val="24"/>
+          <w:szCs w:val="24"/>
         </w:rPr>
         <w:t>Figure 5 below provides a comparison of the ICT GDP overall impact in 2019 in terms of its share in the national economy, encompassing both “Supply Chain” and “Cross-sector Diffusion” GDP impacts.</w:t>
       </w:r>
@@ -374,7 +359,6 @@
           <w:rFonts w:asciiTheme="majorBidi" w:hAnsiTheme="majorBidi" w:cstheme="majorBidi"/>
           <w:sz w:val="24"/>
           <w:szCs w:val="24"/>
-          <w:lang w:val="en-IL"/>
         </w:rPr>
       </w:pPr>
     </w:p>
@@ -390,15 +374,13 @@
           <w:rFonts w:asciiTheme="majorBidi" w:hAnsiTheme="majorBidi" w:cstheme="majorBidi"/>
           <w:sz w:val="24"/>
           <w:szCs w:val="24"/>
-          <w:lang w:val="en-IL"/>
-        </w:rPr>
-      </w:pPr>
-      <w:r>
-        <w:rPr>
-          <w:rFonts w:asciiTheme="majorBidi" w:hAnsiTheme="majorBidi" w:cstheme="majorBidi"/>
-          <w:sz w:val="24"/>
-          <w:szCs w:val="24"/>
-          <w:lang w:val="en-IL"/>
+        </w:rPr>
+      </w:pPr>
+      <w:r>
+        <w:rPr>
+          <w:rFonts w:asciiTheme="majorBidi" w:hAnsiTheme="majorBidi" w:cstheme="majorBidi"/>
+          <w:sz w:val="24"/>
+          <w:szCs w:val="24"/>
         </w:rPr>
         <w:t>ICT GDP Annual Growth over 2010–2019</w:t>
       </w:r>
@@ -411,15 +393,13 @@
           <w:rFonts w:asciiTheme="majorBidi" w:hAnsiTheme="majorBidi" w:cstheme="majorBidi"/>
           <w:sz w:val="24"/>
           <w:szCs w:val="24"/>
-          <w:lang w:val="en-IL"/>
-        </w:rPr>
-      </w:pPr>
-      <w:r>
-        <w:rPr>
-          <w:rFonts w:asciiTheme="majorBidi" w:hAnsiTheme="majorBidi" w:cstheme="majorBidi"/>
-          <w:sz w:val="24"/>
-          <w:szCs w:val="24"/>
-          <w:lang w:val="en-IL"/>
+        </w:rPr>
+      </w:pPr>
+      <w:r>
+        <w:rPr>
+          <w:rFonts w:asciiTheme="majorBidi" w:hAnsiTheme="majorBidi" w:cstheme="majorBidi"/>
+          <w:sz w:val="24"/>
+          <w:szCs w:val="24"/>
         </w:rPr>
         <w:t>Overall ICD GDP compound annual growth (2010-2019)</w:t>
       </w:r>
@@ -432,7 +412,6 @@
           <w:rFonts w:asciiTheme="majorBidi" w:hAnsiTheme="majorBidi" w:cstheme="majorBidi"/>
           <w:sz w:val="24"/>
           <w:szCs w:val="24"/>
-          <w:lang w:val="en-IL"/>
         </w:rPr>
       </w:pPr>
     </w:p>
@@ -448,15 +427,13 @@
           <w:rFonts w:asciiTheme="majorBidi" w:hAnsiTheme="majorBidi" w:cstheme="majorBidi"/>
           <w:sz w:val="24"/>
           <w:szCs w:val="24"/>
-          <w:lang w:val="en-IL"/>
-        </w:rPr>
-      </w:pPr>
-      <w:r>
-        <w:rPr>
-          <w:rFonts w:asciiTheme="majorBidi" w:hAnsiTheme="majorBidi" w:cstheme="majorBidi"/>
-          <w:sz w:val="24"/>
-          <w:szCs w:val="24"/>
-          <w:lang w:val="en-IL"/>
+        </w:rPr>
+      </w:pPr>
+      <w:r>
+        <w:rPr>
+          <w:rFonts w:asciiTheme="majorBidi" w:hAnsiTheme="majorBidi" w:cstheme="majorBidi"/>
+          <w:sz w:val="24"/>
+          <w:szCs w:val="24"/>
         </w:rPr>
         <w:t>ICT Diffusion Impact GDP on Education (% of national GDP)</w:t>
       </w:r>
@@ -489,7 +466,6 @@
           <w:rFonts w:asciiTheme="majorBidi" w:hAnsiTheme="majorBidi" w:cstheme="majorBidi"/>
           <w:sz w:val="24"/>
           <w:szCs w:val="24"/>
-          <w:lang w:val="en-IL"/>
         </w:rPr>
       </w:pPr>
     </w:p>
@@ -505,15 +481,13 @@
           <w:rFonts w:asciiTheme="majorBidi" w:hAnsiTheme="majorBidi" w:cstheme="majorBidi"/>
           <w:sz w:val="24"/>
           <w:szCs w:val="24"/>
-          <w:lang w:val="en-IL"/>
-        </w:rPr>
-      </w:pPr>
-      <w:r>
-        <w:rPr>
-          <w:rFonts w:asciiTheme="majorBidi" w:hAnsiTheme="majorBidi" w:cstheme="majorBidi"/>
-          <w:sz w:val="24"/>
-          <w:szCs w:val="24"/>
-          <w:lang w:val="en-IL"/>
+        </w:rPr>
+      </w:pPr>
+      <w:r>
+        <w:rPr>
+          <w:rFonts w:asciiTheme="majorBidi" w:hAnsiTheme="majorBidi" w:cstheme="majorBidi"/>
+          <w:sz w:val="24"/>
+          <w:szCs w:val="24"/>
         </w:rPr>
         <w:t>ICT Diffusion Impact GDP on Health (% of national GDP)</w:t>
       </w:r>
@@ -526,15 +500,13 @@
           <w:rFonts w:asciiTheme="majorBidi" w:hAnsiTheme="majorBidi" w:cstheme="majorBidi"/>
           <w:sz w:val="24"/>
           <w:szCs w:val="24"/>
-          <w:lang w:val="en-IL"/>
-        </w:rPr>
-      </w:pPr>
-      <w:r>
-        <w:rPr>
-          <w:rFonts w:asciiTheme="majorBidi" w:hAnsiTheme="majorBidi" w:cstheme="majorBidi"/>
-          <w:sz w:val="24"/>
-          <w:szCs w:val="24"/>
-          <w:lang w:val="en-IL"/>
+        </w:rPr>
+      </w:pPr>
+      <w:r>
+        <w:rPr>
+          <w:rFonts w:asciiTheme="majorBidi" w:hAnsiTheme="majorBidi" w:cstheme="majorBidi"/>
+          <w:sz w:val="24"/>
+          <w:szCs w:val="24"/>
         </w:rPr>
         <w:t xml:space="preserve">In terms of the </w:t>
       </w:r>
@@ -544,7 +516,6 @@
           <w:rFonts w:asciiTheme="majorBidi" w:hAnsiTheme="majorBidi" w:cstheme="majorBidi"/>
           <w:sz w:val="24"/>
           <w:szCs w:val="24"/>
-          <w:lang w:val="en-IL"/>
         </w:rPr>
         <w:t>KSA’s</w:t>
       </w:r>
@@ -554,7 +525,6 @@
           <w:rFonts w:asciiTheme="majorBidi" w:hAnsiTheme="majorBidi" w:cstheme="majorBidi"/>
           <w:sz w:val="24"/>
           <w:szCs w:val="24"/>
-          <w:lang w:val="en-IL"/>
         </w:rPr>
         <w:t xml:space="preserve"> ICT Diffusion GDP Impact on the health sector, its contribution doubled from 0.05% (2010) to 0.11% (2019).</w:t>
       </w:r>
@@ -566,7 +536,244 @@
           <w:rFonts w:asciiTheme="majorBidi" w:hAnsiTheme="majorBidi" w:cstheme="majorBidi"/>
           <w:sz w:val="24"/>
           <w:szCs w:val="24"/>
-          <w:lang w:val="en-IL"/>
+          <w:rtl/>
+        </w:rPr>
+      </w:pPr>
+    </w:p>
+    <w:p>
+      <w:pPr>
+        <w:spacing w:after="0"/>
+        <w:rPr>
+          <w:rFonts w:asciiTheme="majorBidi" w:hAnsiTheme="majorBidi" w:cstheme="majorBidi"/>
+          <w:sz w:val="24"/>
+          <w:szCs w:val="24"/>
+          <w:rtl/>
+        </w:rPr>
+      </w:pPr>
+    </w:p>
+    <w:p>
+      <w:pPr>
+        <w:spacing w:after="0"/>
+        <w:rPr>
+          <w:rFonts w:asciiTheme="majorBidi" w:hAnsiTheme="majorBidi" w:cstheme="majorBidi"/>
+          <w:sz w:val="24"/>
+          <w:szCs w:val="24"/>
+          <w:rtl/>
+        </w:rPr>
+      </w:pPr>
+    </w:p>
+    <w:p>
+      <w:pPr>
+        <w:spacing w:after="0"/>
+        <w:rPr>
+          <w:rFonts w:asciiTheme="majorBidi" w:hAnsiTheme="majorBidi" w:cstheme="majorBidi"/>
+          <w:sz w:val="24"/>
+          <w:szCs w:val="24"/>
+          <w:lang w:val="en-US"/>
+        </w:rPr>
+      </w:pPr>
+      <w:r>
+        <w:rPr>
+          <w:rFonts w:asciiTheme="majorBidi" w:hAnsiTheme="majorBidi" w:cstheme="majorBidi"/>
+          <w:sz w:val="24"/>
+          <w:szCs w:val="24"/>
+          <w:lang w:val="en-US"/>
+        </w:rPr>
+        <w:t>Employment</w:t>
+      </w:r>
+    </w:p>
+    <w:p>
+      <w:pPr>
+        <w:pStyle w:val="ListParagraph"/>
+        <w:numPr>
+          <w:ilvl w:val="0"/>
+          <w:numId w:val="2"/>
+        </w:numPr>
+        <w:spacing w:after="120" w:line="240" w:lineRule="auto"/>
+        <w:ind w:left="357" w:hanging="357"/>
+        <w:contextualSpacing w:val="0"/>
+        <w:rPr>
+          <w:b/>
+          <w:bCs/>
+          <w:i/>
+          <w:iCs/>
+          <w:lang w:eastAsia="en-CA"/>
+        </w:rPr>
+      </w:pPr>
+      <w:r>
+        <w:rPr>
+          <w:i/>
+          <w:iCs/>
+          <w:lang w:eastAsia="en-CA"/>
+        </w:rPr>
+        <w:t>Direct Employment</w:t>
+      </w:r>
+      <w:r>
+        <w:rPr>
+          <w:i/>
+          <w:iCs/>
+          <w:lang w:eastAsia="en-CA"/>
+        </w:rPr>
+        <w:t xml:space="preserve"> (DE)</w:t>
+      </w:r>
+      <w:r>
+        <w:rPr>
+          <w:lang w:eastAsia="en-CA"/>
+        </w:rPr>
+        <w:t xml:space="preserve">, which represents persons employed within the ICT sector to produce its total domestic output, referred to as </w:t>
+      </w:r>
+      <w:r>
+        <w:rPr>
+          <w:b/>
+          <w:bCs/>
+          <w:i/>
+          <w:iCs/>
+          <w:lang w:eastAsia="en-CA"/>
+        </w:rPr>
+        <w:t>“Direct Impact</w:t>
+      </w:r>
+      <w:r>
+        <w:rPr>
+          <w:b/>
+          <w:bCs/>
+          <w:i/>
+          <w:iCs/>
+          <w:lang w:eastAsia="en-CA"/>
+        </w:rPr>
+        <w:t>.</w:t>
+      </w:r>
+      <w:r>
+        <w:rPr>
+          <w:b/>
+          <w:bCs/>
+          <w:i/>
+          <w:iCs/>
+          <w:lang w:eastAsia="en-CA"/>
+        </w:rPr>
+        <w:t>”</w:t>
+      </w:r>
+    </w:p>
+    <w:p>
+      <w:pPr>
+        <w:pStyle w:val="ListParagraph"/>
+        <w:numPr>
+          <w:ilvl w:val="0"/>
+          <w:numId w:val="2"/>
+        </w:numPr>
+        <w:spacing w:after="120" w:line="240" w:lineRule="auto"/>
+        <w:ind w:left="357" w:hanging="357"/>
+        <w:contextualSpacing w:val="0"/>
+        <w:rPr>
+          <w:b/>
+          <w:bCs/>
+          <w:i/>
+          <w:iCs/>
+          <w:lang w:eastAsia="en-CA"/>
+        </w:rPr>
+      </w:pPr>
+      <w:r>
+        <w:rPr>
+          <w:i/>
+          <w:iCs/>
+          <w:lang w:eastAsia="en-CA"/>
+        </w:rPr>
+        <w:t>Supply Chain Employment</w:t>
+      </w:r>
+      <w:r>
+        <w:rPr>
+          <w:i/>
+          <w:iCs/>
+          <w:lang w:eastAsia="en-CA"/>
+        </w:rPr>
+        <w:t xml:space="preserve"> (SC)</w:t>
+      </w:r>
+      <w:r>
+        <w:rPr>
+          <w:lang w:eastAsia="en-CA"/>
+        </w:rPr>
+        <w:t xml:space="preserve">, which represents the persons employed by the suppliers of the ICT sector to meet its demands for inputs to produce ICT products and services (referred to as </w:t>
+      </w:r>
+      <w:r>
+        <w:rPr>
+          <w:b/>
+          <w:bCs/>
+          <w:i/>
+          <w:iCs/>
+          <w:lang w:eastAsia="en-CA"/>
+        </w:rPr>
+        <w:t>“indirect impact”</w:t>
+      </w:r>
+      <w:r>
+        <w:rPr>
+          <w:lang w:eastAsia="en-CA"/>
+        </w:rPr>
+        <w:t xml:space="preserve">). It also includes the employment generated as a result of re-spending salaries and wages earned by the persons employed by the ICT sector and its suppliers across the entire economy, referred to as </w:t>
+      </w:r>
+      <w:r>
+        <w:rPr>
+          <w:b/>
+          <w:bCs/>
+          <w:i/>
+          <w:iCs/>
+          <w:lang w:eastAsia="en-CA"/>
+        </w:rPr>
+        <w:t>“Induced Impact</w:t>
+      </w:r>
+      <w:r>
+        <w:rPr>
+          <w:b/>
+          <w:bCs/>
+          <w:i/>
+          <w:iCs/>
+          <w:lang w:eastAsia="en-CA"/>
+        </w:rPr>
+        <w:t>.”</w:t>
+      </w:r>
+    </w:p>
+    <w:p>
+      <w:pPr>
+        <w:pStyle w:val="ListParagraph"/>
+        <w:numPr>
+          <w:ilvl w:val="0"/>
+          <w:numId w:val="2"/>
+        </w:numPr>
+        <w:spacing w:after="120" w:line="240" w:lineRule="auto"/>
+        <w:rPr>
+          <w:lang w:eastAsia="en-CA"/>
+        </w:rPr>
+      </w:pPr>
+      <w:r>
+        <w:rPr>
+          <w:i/>
+          <w:iCs/>
+          <w:lang w:eastAsia="en-CA"/>
+        </w:rPr>
+        <w:t xml:space="preserve">Cross-sector Diffusion Employment (CD), </w:t>
+      </w:r>
+      <w:r>
+        <w:rPr>
+          <w:lang w:eastAsia="en-CA"/>
+        </w:rPr>
+        <w:t>which represents persons employed by other sectors of the economy to enable the use of ICT products and services for the production of their outputs.</w:t>
+      </w:r>
+    </w:p>
+    <w:p>
+      <w:pPr>
+        <w:spacing w:after="0"/>
+        <w:rPr>
+          <w:rFonts w:asciiTheme="majorBidi" w:hAnsiTheme="majorBidi" w:cstheme="majorBidi"/>
+          <w:sz w:val="24"/>
+          <w:szCs w:val="24"/>
+        </w:rPr>
+      </w:pPr>
+    </w:p>
+    <w:p>
+      <w:pPr>
+        <w:spacing w:after="0"/>
+        <w:rPr>
+          <w:rFonts w:asciiTheme="majorBidi" w:hAnsiTheme="majorBidi" w:cstheme="majorBidi"/>
+          <w:sz w:val="24"/>
+          <w:szCs w:val="24"/>
         </w:rPr>
       </w:pPr>
     </w:p>
@@ -582,15 +789,13 @@
           <w:rFonts w:asciiTheme="majorBidi" w:hAnsiTheme="majorBidi" w:cstheme="majorBidi"/>
           <w:sz w:val="24"/>
           <w:szCs w:val="24"/>
-          <w:lang w:val="en-IL"/>
-        </w:rPr>
-      </w:pPr>
-      <w:r>
-        <w:rPr>
-          <w:rFonts w:asciiTheme="majorBidi" w:hAnsiTheme="majorBidi" w:cstheme="majorBidi"/>
-          <w:sz w:val="24"/>
-          <w:szCs w:val="24"/>
-          <w:lang w:val="en-IL"/>
+        </w:rPr>
+      </w:pPr>
+      <w:r>
+        <w:rPr>
+          <w:rFonts w:asciiTheme="majorBidi" w:hAnsiTheme="majorBidi" w:cstheme="majorBidi"/>
+          <w:sz w:val="24"/>
+          <w:szCs w:val="24"/>
         </w:rPr>
         <w:t>Comparison of ICT Sector Employment Impact in 2019</w:t>
       </w:r>
@@ -615,6 +820,32 @@
         </w:rPr>
         <w:t>Figure 9: Comparison of ICT Sector Employment Impact in 2019</w:t>
       </w:r>
+    </w:p>
+    <w:p>
+      <w:pPr>
+        <w:spacing w:after="0"/>
+        <w:ind w:left="720"/>
+        <w:rPr>
+          <w:rFonts w:asciiTheme="majorBidi" w:hAnsiTheme="majorBidi" w:cstheme="majorBidi"/>
+          <w:sz w:val="24"/>
+          <w:szCs w:val="24"/>
+          <w:rtl/>
+          <w:lang w:val="en-CA"/>
+        </w:rPr>
+      </w:pPr>
+    </w:p>
+    <w:p>
+      <w:pPr>
+        <w:spacing w:after="0"/>
+        <w:ind w:left="720"/>
+        <w:rPr>
+          <w:rFonts w:asciiTheme="majorBidi" w:hAnsiTheme="majorBidi" w:cstheme="majorBidi"/>
+          <w:sz w:val="24"/>
+          <w:szCs w:val="24"/>
+          <w:rtl/>
+          <w:lang w:val="en-CA"/>
+        </w:rPr>
+      </w:pPr>
     </w:p>
     <w:p>
       <w:pPr>
@@ -640,15 +871,13 @@
           <w:rFonts w:asciiTheme="majorBidi" w:hAnsiTheme="majorBidi" w:cstheme="majorBidi"/>
           <w:sz w:val="24"/>
           <w:szCs w:val="24"/>
-          <w:lang w:val="en-IL"/>
-        </w:rPr>
-      </w:pPr>
-      <w:r>
-        <w:rPr>
-          <w:rFonts w:asciiTheme="majorBidi" w:hAnsiTheme="majorBidi" w:cstheme="majorBidi"/>
-          <w:sz w:val="24"/>
-          <w:szCs w:val="24"/>
-          <w:lang w:val="en-IL"/>
+        </w:rPr>
+      </w:pPr>
+      <w:r>
+        <w:rPr>
+          <w:rFonts w:asciiTheme="majorBidi" w:hAnsiTheme="majorBidi" w:cstheme="majorBidi"/>
+          <w:sz w:val="24"/>
+          <w:szCs w:val="24"/>
         </w:rPr>
         <w:t>2019 ICT Cross-Sector Diffusion Employment Impact Ratio</w:t>
       </w:r>
@@ -674,24 +903,11 @@
     </w:p>
     <w:p>
       <w:pPr>
-        <w:pStyle w:val="ListParagraph"/>
-        <w:spacing w:after="0"/>
-        <w:rPr>
-          <w:rFonts w:asciiTheme="majorBidi" w:hAnsiTheme="majorBidi" w:cstheme="majorBidi"/>
-          <w:sz w:val="24"/>
-          <w:szCs w:val="24"/>
-          <w:lang w:val="en-IL"/>
-        </w:rPr>
-      </w:pPr>
-    </w:p>
-    <w:p>
-      <w:pPr>
-        <w:spacing w:after="0"/>
-        <w:rPr>
-          <w:rFonts w:asciiTheme="majorBidi" w:hAnsiTheme="majorBidi" w:cstheme="majorBidi"/>
-          <w:sz w:val="24"/>
-          <w:szCs w:val="24"/>
-          <w:lang w:val="en-IL"/>
+        <w:spacing w:after="0"/>
+        <w:rPr>
+          <w:rFonts w:asciiTheme="majorBidi" w:hAnsiTheme="majorBidi" w:cstheme="majorBidi"/>
+          <w:sz w:val="24"/>
+          <w:szCs w:val="24"/>
         </w:rPr>
       </w:pPr>
     </w:p>
@@ -707,15 +923,13 @@
           <w:rFonts w:asciiTheme="majorBidi" w:hAnsiTheme="majorBidi" w:cstheme="majorBidi"/>
           <w:sz w:val="24"/>
           <w:szCs w:val="24"/>
-          <w:lang w:val="en-IL"/>
-        </w:rPr>
-      </w:pPr>
-      <w:r>
-        <w:rPr>
-          <w:rFonts w:asciiTheme="majorBidi" w:hAnsiTheme="majorBidi" w:cstheme="majorBidi"/>
-          <w:sz w:val="24"/>
-          <w:szCs w:val="24"/>
-          <w:lang w:val="en-IL"/>
+        </w:rPr>
+      </w:pPr>
+      <w:r>
+        <w:rPr>
+          <w:rFonts w:asciiTheme="majorBidi" w:hAnsiTheme="majorBidi" w:cstheme="majorBidi"/>
+          <w:sz w:val="24"/>
+          <w:szCs w:val="24"/>
         </w:rPr>
         <w:t>ICT Employment Impact Ratio (Increase/decrease from 2010 to 2019)</w:t>
       </w:r>
@@ -785,15 +999,13 @@
           <w:rFonts w:asciiTheme="majorBidi" w:hAnsiTheme="majorBidi" w:cstheme="majorBidi"/>
           <w:sz w:val="24"/>
           <w:szCs w:val="24"/>
-          <w:lang w:val="en-IL"/>
-        </w:rPr>
-      </w:pPr>
-      <w:r>
-        <w:rPr>
-          <w:rFonts w:asciiTheme="majorBidi" w:hAnsiTheme="majorBidi" w:cstheme="majorBidi"/>
-          <w:sz w:val="24"/>
-          <w:szCs w:val="24"/>
-          <w:lang w:val="en-IL"/>
+        </w:rPr>
+      </w:pPr>
+      <w:r>
+        <w:rPr>
+          <w:rFonts w:asciiTheme="majorBidi" w:hAnsiTheme="majorBidi" w:cstheme="majorBidi"/>
+          <w:sz w:val="24"/>
+          <w:szCs w:val="24"/>
         </w:rPr>
         <w:t>Overall ICT Productivity - GDP per employee (in SAR 000)</w:t>
       </w:r>
@@ -860,15 +1072,13 @@
           <w:rFonts w:asciiTheme="majorBidi" w:hAnsiTheme="majorBidi" w:cstheme="majorBidi"/>
           <w:sz w:val="24"/>
           <w:szCs w:val="24"/>
-          <w:lang w:val="en-IL"/>
-        </w:rPr>
-      </w:pPr>
-      <w:r>
-        <w:rPr>
-          <w:rFonts w:asciiTheme="majorBidi" w:hAnsiTheme="majorBidi" w:cstheme="majorBidi"/>
-          <w:sz w:val="24"/>
-          <w:szCs w:val="24"/>
-          <w:lang w:val="en-IL"/>
+        </w:rPr>
+      </w:pPr>
+      <w:r>
+        <w:rPr>
+          <w:rFonts w:asciiTheme="majorBidi" w:hAnsiTheme="majorBidi" w:cstheme="majorBidi"/>
+          <w:sz w:val="24"/>
+          <w:szCs w:val="24"/>
         </w:rPr>
         <w:t>Overall ICT Productivity Annual Growth (CAGR) 2010–2019</w:t>
       </w:r>
@@ -930,37 +1140,33 @@
           <w:rFonts w:asciiTheme="majorBidi" w:hAnsiTheme="majorBidi" w:cstheme="majorBidi"/>
           <w:sz w:val="24"/>
           <w:szCs w:val="24"/>
-          <w:lang w:val="en-IL"/>
-        </w:rPr>
-      </w:pPr>
-    </w:p>
-    <w:p>
-      <w:pPr>
-        <w:spacing w:after="0"/>
-        <w:rPr>
-          <w:rFonts w:asciiTheme="majorBidi" w:hAnsiTheme="majorBidi" w:cstheme="majorBidi"/>
-          <w:sz w:val="24"/>
-          <w:szCs w:val="24"/>
-          <w:lang w:val="en-IL"/>
-        </w:rPr>
-      </w:pPr>
-    </w:p>
-    <w:p>
-      <w:pPr>
-        <w:spacing w:after="0"/>
-        <w:rPr>
-          <w:rFonts w:asciiTheme="majorBidi" w:hAnsiTheme="majorBidi" w:cstheme="majorBidi"/>
-          <w:sz w:val="24"/>
-          <w:szCs w:val="24"/>
-          <w:lang w:val="en-IL"/>
-        </w:rPr>
-      </w:pPr>
-      <w:r>
-        <w:rPr>
-          <w:rFonts w:asciiTheme="majorBidi" w:hAnsiTheme="majorBidi" w:cstheme="majorBidi"/>
-          <w:sz w:val="24"/>
-          <w:szCs w:val="24"/>
-          <w:lang w:val="en-IL"/>
+        </w:rPr>
+      </w:pPr>
+    </w:p>
+    <w:p>
+      <w:pPr>
+        <w:spacing w:after="0"/>
+        <w:rPr>
+          <w:rFonts w:asciiTheme="majorBidi" w:hAnsiTheme="majorBidi" w:cstheme="majorBidi"/>
+          <w:sz w:val="24"/>
+          <w:szCs w:val="24"/>
+        </w:rPr>
+      </w:pPr>
+    </w:p>
+    <w:p>
+      <w:pPr>
+        <w:spacing w:after="0"/>
+        <w:rPr>
+          <w:rFonts w:asciiTheme="majorBidi" w:hAnsiTheme="majorBidi" w:cstheme="majorBidi"/>
+          <w:sz w:val="24"/>
+          <w:szCs w:val="24"/>
+        </w:rPr>
+      </w:pPr>
+      <w:r>
+        <w:rPr>
+          <w:rFonts w:asciiTheme="majorBidi" w:hAnsiTheme="majorBidi" w:cstheme="majorBidi"/>
+          <w:sz w:val="24"/>
+          <w:szCs w:val="24"/>
         </w:rPr>
         <w:t>Data needed:</w:t>
       </w:r>
@@ -972,15 +1178,13 @@
           <w:rFonts w:asciiTheme="majorBidi" w:hAnsiTheme="majorBidi" w:cstheme="majorBidi"/>
           <w:sz w:val="24"/>
           <w:szCs w:val="24"/>
-          <w:lang w:val="en-IL"/>
-        </w:rPr>
-      </w:pPr>
-      <w:r>
-        <w:rPr>
-          <w:rFonts w:asciiTheme="majorBidi" w:hAnsiTheme="majorBidi" w:cstheme="majorBidi"/>
-          <w:sz w:val="24"/>
-          <w:szCs w:val="24"/>
-          <w:lang w:val="en-IL"/>
+        </w:rPr>
+      </w:pPr>
+      <w:r>
+        <w:rPr>
+          <w:rFonts w:asciiTheme="majorBidi" w:hAnsiTheme="majorBidi" w:cstheme="majorBidi"/>
+          <w:sz w:val="24"/>
+          <w:szCs w:val="24"/>
         </w:rPr>
         <w:t>Years 2012 – 2022</w:t>
       </w:r>
@@ -990,22 +1194,19 @@
         <w:spacing w:after="0"/>
         <w:rPr>
           <w:rFonts w:asciiTheme="majorBidi" w:hAnsiTheme="majorBidi" w:cstheme="majorBidi"/>
-          <w:lang w:val="en-IL"/>
-        </w:rPr>
-      </w:pPr>
-      <w:r>
-        <w:rPr>
-          <w:rFonts w:asciiTheme="majorBidi" w:hAnsiTheme="majorBidi" w:cstheme="majorBidi"/>
-          <w:sz w:val="24"/>
-          <w:szCs w:val="24"/>
-          <w:lang w:val="en-IL"/>
+        </w:rPr>
+      </w:pPr>
+      <w:r>
+        <w:rPr>
+          <w:rFonts w:asciiTheme="majorBidi" w:hAnsiTheme="majorBidi" w:cstheme="majorBidi"/>
+          <w:sz w:val="24"/>
+          <w:szCs w:val="24"/>
         </w:rPr>
         <w:t xml:space="preserve">Countries </w:t>
       </w:r>
       <w:r>
         <w:rPr>
           <w:rFonts w:asciiTheme="majorBidi" w:hAnsiTheme="majorBidi" w:cstheme="majorBidi"/>
-          <w:lang w:val="en-IL"/>
         </w:rPr>
         <w:t xml:space="preserve">  </w:t>
       </w:r>
@@ -1014,7 +1215,6 @@
           <w:rFonts w:asciiTheme="majorBidi" w:hAnsiTheme="majorBidi" w:cstheme="majorBidi"/>
           <w:b/>
           <w:bCs/>
-          <w:lang w:val="en-IL"/>
         </w:rPr>
         <w:t>Canada</w:t>
       </w:r>
@@ -1026,15 +1226,13 @@
           <w:rFonts w:asciiTheme="majorBidi" w:hAnsiTheme="majorBidi" w:cstheme="majorBidi"/>
           <w:sz w:val="24"/>
           <w:szCs w:val="24"/>
-          <w:lang w:val="en-IL"/>
-        </w:rPr>
-      </w:pPr>
-      <w:r>
-        <w:rPr>
-          <w:rFonts w:asciiTheme="majorBidi" w:hAnsiTheme="majorBidi" w:cstheme="majorBidi"/>
-          <w:sz w:val="24"/>
-          <w:szCs w:val="24"/>
-          <w:lang w:val="en-IL"/>
+        </w:rPr>
+      </w:pPr>
+      <w:r>
+        <w:rPr>
+          <w:rFonts w:asciiTheme="majorBidi" w:hAnsiTheme="majorBidi" w:cstheme="majorBidi"/>
+          <w:sz w:val="24"/>
+          <w:szCs w:val="24"/>
         </w:rPr>
         <w:t xml:space="preserve">  </w:t>
       </w:r>
@@ -1045,7 +1243,6 @@
           <w:bCs/>
           <w:sz w:val="24"/>
           <w:szCs w:val="24"/>
-          <w:lang w:val="en-IL"/>
         </w:rPr>
         <w:t>France</w:t>
       </w:r>
@@ -1057,15 +1254,13 @@
           <w:rFonts w:asciiTheme="majorBidi" w:hAnsiTheme="majorBidi" w:cstheme="majorBidi"/>
           <w:sz w:val="24"/>
           <w:szCs w:val="24"/>
-          <w:lang w:val="en-IL"/>
-        </w:rPr>
-      </w:pPr>
-      <w:r>
-        <w:rPr>
-          <w:rFonts w:asciiTheme="majorBidi" w:hAnsiTheme="majorBidi" w:cstheme="majorBidi"/>
-          <w:sz w:val="24"/>
-          <w:szCs w:val="24"/>
-          <w:lang w:val="en-IL"/>
+        </w:rPr>
+      </w:pPr>
+      <w:r>
+        <w:rPr>
+          <w:rFonts w:asciiTheme="majorBidi" w:hAnsiTheme="majorBidi" w:cstheme="majorBidi"/>
+          <w:sz w:val="24"/>
+          <w:szCs w:val="24"/>
         </w:rPr>
         <w:t xml:space="preserve">  </w:t>
       </w:r>
@@ -1076,7 +1271,6 @@
           <w:bCs/>
           <w:sz w:val="24"/>
           <w:szCs w:val="24"/>
-          <w:lang w:val="en-IL"/>
         </w:rPr>
         <w:t>Germany</w:t>
       </w:r>
@@ -1088,15 +1282,13 @@
           <w:rFonts w:asciiTheme="majorBidi" w:hAnsiTheme="majorBidi" w:cstheme="majorBidi"/>
           <w:sz w:val="24"/>
           <w:szCs w:val="24"/>
-          <w:lang w:val="en-IL"/>
-        </w:rPr>
-      </w:pPr>
-      <w:r>
-        <w:rPr>
-          <w:rFonts w:asciiTheme="majorBidi" w:hAnsiTheme="majorBidi" w:cstheme="majorBidi"/>
-          <w:sz w:val="24"/>
-          <w:szCs w:val="24"/>
-          <w:lang w:val="en-IL"/>
+        </w:rPr>
+      </w:pPr>
+      <w:r>
+        <w:rPr>
+          <w:rFonts w:asciiTheme="majorBidi" w:hAnsiTheme="majorBidi" w:cstheme="majorBidi"/>
+          <w:sz w:val="24"/>
+          <w:szCs w:val="24"/>
         </w:rPr>
         <w:t xml:space="preserve">  </w:t>
       </w:r>
@@ -1107,7 +1299,6 @@
           <w:bCs/>
           <w:sz w:val="24"/>
           <w:szCs w:val="24"/>
-          <w:lang w:val="en-IL"/>
         </w:rPr>
         <w:t>Italy</w:t>
       </w:r>
@@ -1119,15 +1310,13 @@
           <w:rFonts w:asciiTheme="majorBidi" w:hAnsiTheme="majorBidi" w:cstheme="majorBidi"/>
           <w:sz w:val="24"/>
           <w:szCs w:val="24"/>
-          <w:lang w:val="en-IL"/>
-        </w:rPr>
-      </w:pPr>
-      <w:r>
-        <w:rPr>
-          <w:rFonts w:asciiTheme="majorBidi" w:hAnsiTheme="majorBidi" w:cstheme="majorBidi"/>
-          <w:sz w:val="24"/>
-          <w:szCs w:val="24"/>
-          <w:lang w:val="en-IL"/>
+        </w:rPr>
+      </w:pPr>
+      <w:r>
+        <w:rPr>
+          <w:rFonts w:asciiTheme="majorBidi" w:hAnsiTheme="majorBidi" w:cstheme="majorBidi"/>
+          <w:sz w:val="24"/>
+          <w:szCs w:val="24"/>
         </w:rPr>
         <w:t xml:space="preserve">  </w:t>
       </w:r>
@@ -1138,7 +1327,6 @@
           <w:bCs/>
           <w:sz w:val="24"/>
           <w:szCs w:val="24"/>
-          <w:lang w:val="en-IL"/>
         </w:rPr>
         <w:t>Japan</w:t>
       </w:r>
@@ -1150,15 +1338,13 @@
           <w:rFonts w:asciiTheme="majorBidi" w:hAnsiTheme="majorBidi" w:cstheme="majorBidi"/>
           <w:sz w:val="24"/>
           <w:szCs w:val="24"/>
-          <w:lang w:val="en-IL"/>
-        </w:rPr>
-      </w:pPr>
-      <w:r>
-        <w:rPr>
-          <w:rFonts w:asciiTheme="majorBidi" w:hAnsiTheme="majorBidi" w:cstheme="majorBidi"/>
-          <w:sz w:val="24"/>
-          <w:szCs w:val="24"/>
-          <w:lang w:val="en-IL"/>
+        </w:rPr>
+      </w:pPr>
+      <w:r>
+        <w:rPr>
+          <w:rFonts w:asciiTheme="majorBidi" w:hAnsiTheme="majorBidi" w:cstheme="majorBidi"/>
+          <w:sz w:val="24"/>
+          <w:szCs w:val="24"/>
         </w:rPr>
         <w:t xml:space="preserve">  </w:t>
       </w:r>
@@ -1169,7 +1355,6 @@
           <w:bCs/>
           <w:sz w:val="24"/>
           <w:szCs w:val="24"/>
-          <w:lang w:val="en-IL"/>
         </w:rPr>
         <w:t>United Kingdom</w:t>
       </w:r>
@@ -1181,15 +1366,13 @@
           <w:rFonts w:asciiTheme="majorBidi" w:hAnsiTheme="majorBidi" w:cstheme="majorBidi"/>
           <w:sz w:val="24"/>
           <w:szCs w:val="24"/>
-          <w:lang w:val="en-IL"/>
-        </w:rPr>
-      </w:pPr>
-      <w:r>
-        <w:rPr>
-          <w:rFonts w:asciiTheme="majorBidi" w:hAnsiTheme="majorBidi" w:cstheme="majorBidi"/>
-          <w:sz w:val="24"/>
-          <w:szCs w:val="24"/>
-          <w:lang w:val="en-IL"/>
+        </w:rPr>
+      </w:pPr>
+      <w:r>
+        <w:rPr>
+          <w:rFonts w:asciiTheme="majorBidi" w:hAnsiTheme="majorBidi" w:cstheme="majorBidi"/>
+          <w:sz w:val="24"/>
+          <w:szCs w:val="24"/>
         </w:rPr>
         <w:t xml:space="preserve">  </w:t>
       </w:r>
@@ -1200,7 +1383,6 @@
           <w:bCs/>
           <w:sz w:val="24"/>
           <w:szCs w:val="24"/>
-          <w:lang w:val="en-IL"/>
         </w:rPr>
         <w:t>United States</w:t>
       </w:r>
@@ -1212,26 +1394,23 @@
           <w:rFonts w:asciiTheme="majorBidi" w:hAnsiTheme="majorBidi" w:cstheme="majorBidi"/>
           <w:sz w:val="24"/>
           <w:szCs w:val="24"/>
-          <w:lang w:val="en-IL"/>
-        </w:rPr>
-      </w:pPr>
-    </w:p>
-    <w:p>
-      <w:pPr>
-        <w:spacing w:after="0"/>
-        <w:rPr>
-          <w:rFonts w:asciiTheme="majorBidi" w:hAnsiTheme="majorBidi" w:cstheme="majorBidi"/>
-          <w:sz w:val="24"/>
-          <w:szCs w:val="24"/>
-          <w:lang w:val="en-IL"/>
-        </w:rPr>
-      </w:pPr>
-      <w:r>
-        <w:rPr>
-          <w:rFonts w:asciiTheme="majorBidi" w:hAnsiTheme="majorBidi" w:cstheme="majorBidi"/>
-          <w:sz w:val="24"/>
-          <w:szCs w:val="24"/>
-          <w:lang w:val="en-IL"/>
+        </w:rPr>
+      </w:pPr>
+    </w:p>
+    <w:p>
+      <w:pPr>
+        <w:spacing w:after="0"/>
+        <w:rPr>
+          <w:rFonts w:asciiTheme="majorBidi" w:hAnsiTheme="majorBidi" w:cstheme="majorBidi"/>
+          <w:sz w:val="24"/>
+          <w:szCs w:val="24"/>
+        </w:rPr>
+      </w:pPr>
+      <w:r>
+        <w:rPr>
+          <w:rFonts w:asciiTheme="majorBidi" w:hAnsiTheme="majorBidi" w:cstheme="majorBidi"/>
+          <w:sz w:val="24"/>
+          <w:szCs w:val="24"/>
         </w:rPr>
         <w:t>Output</w:t>
       </w:r>
@@ -1243,7 +1422,6 @@
           <w:rFonts w:asciiTheme="majorBidi" w:hAnsiTheme="majorBidi" w:cstheme="majorBidi"/>
           <w:sz w:val="24"/>
           <w:szCs w:val="24"/>
-          <w:lang w:val="en-IL"/>
         </w:rPr>
       </w:pPr>
     </w:p>
@@ -1345,8 +1523,124 @@
       </w:pPr>
     </w:lvl>
   </w:abstractNum>
+  <w:abstractNum w:abstractNumId="1" w15:restartNumberingAfterBreak="0">
+    <w:nsid w:val="77DB5420"/>
+    <w:multiLevelType w:val="hybridMultilevel"/>
+    <w:tmpl w:val="D79C3920"/>
+    <w:lvl w:ilvl="0" w:tplc="10090001">
+      <w:start w:val="1"/>
+      <w:numFmt w:val="bullet"/>
+      <w:lvlText w:val=""/>
+      <w:lvlJc w:val="left"/>
+      <w:pPr>
+        <w:ind w:left="360" w:hanging="360"/>
+      </w:pPr>
+      <w:rPr>
+        <w:rFonts w:ascii="Symbol" w:hAnsi="Symbol" w:hint="default"/>
+      </w:rPr>
+    </w:lvl>
+    <w:lvl w:ilvl="1" w:tplc="10090003" w:tentative="1">
+      <w:start w:val="1"/>
+      <w:numFmt w:val="bullet"/>
+      <w:lvlText w:val="o"/>
+      <w:lvlJc w:val="left"/>
+      <w:pPr>
+        <w:ind w:left="1080" w:hanging="360"/>
+      </w:pPr>
+      <w:rPr>
+        <w:rFonts w:ascii="Courier New" w:hAnsi="Courier New" w:cs="Courier New" w:hint="default"/>
+      </w:rPr>
+    </w:lvl>
+    <w:lvl w:ilvl="2" w:tplc="10090005" w:tentative="1">
+      <w:start w:val="1"/>
+      <w:numFmt w:val="bullet"/>
+      <w:lvlText w:val=""/>
+      <w:lvlJc w:val="left"/>
+      <w:pPr>
+        <w:ind w:left="1800" w:hanging="360"/>
+      </w:pPr>
+      <w:rPr>
+        <w:rFonts w:ascii="Wingdings" w:hAnsi="Wingdings" w:hint="default"/>
+      </w:rPr>
+    </w:lvl>
+    <w:lvl w:ilvl="3" w:tplc="10090001" w:tentative="1">
+      <w:start w:val="1"/>
+      <w:numFmt w:val="bullet"/>
+      <w:lvlText w:val=""/>
+      <w:lvlJc w:val="left"/>
+      <w:pPr>
+        <w:ind w:left="2520" w:hanging="360"/>
+      </w:pPr>
+      <w:rPr>
+        <w:rFonts w:ascii="Symbol" w:hAnsi="Symbol" w:hint="default"/>
+      </w:rPr>
+    </w:lvl>
+    <w:lvl w:ilvl="4" w:tplc="10090003" w:tentative="1">
+      <w:start w:val="1"/>
+      <w:numFmt w:val="bullet"/>
+      <w:lvlText w:val="o"/>
+      <w:lvlJc w:val="left"/>
+      <w:pPr>
+        <w:ind w:left="3240" w:hanging="360"/>
+      </w:pPr>
+      <w:rPr>
+        <w:rFonts w:ascii="Courier New" w:hAnsi="Courier New" w:cs="Courier New" w:hint="default"/>
+      </w:rPr>
+    </w:lvl>
+    <w:lvl w:ilvl="5" w:tplc="10090005" w:tentative="1">
+      <w:start w:val="1"/>
+      <w:numFmt w:val="bullet"/>
+      <w:lvlText w:val=""/>
+      <w:lvlJc w:val="left"/>
+      <w:pPr>
+        <w:ind w:left="3960" w:hanging="360"/>
+      </w:pPr>
+      <w:rPr>
+        <w:rFonts w:ascii="Wingdings" w:hAnsi="Wingdings" w:hint="default"/>
+      </w:rPr>
+    </w:lvl>
+    <w:lvl w:ilvl="6" w:tplc="10090001" w:tentative="1">
+      <w:start w:val="1"/>
+      <w:numFmt w:val="bullet"/>
+      <w:lvlText w:val=""/>
+      <w:lvlJc w:val="left"/>
+      <w:pPr>
+        <w:ind w:left="4680" w:hanging="360"/>
+      </w:pPr>
+      <w:rPr>
+        <w:rFonts w:ascii="Symbol" w:hAnsi="Symbol" w:hint="default"/>
+      </w:rPr>
+    </w:lvl>
+    <w:lvl w:ilvl="7" w:tplc="10090003" w:tentative="1">
+      <w:start w:val="1"/>
+      <w:numFmt w:val="bullet"/>
+      <w:lvlText w:val="o"/>
+      <w:lvlJc w:val="left"/>
+      <w:pPr>
+        <w:ind w:left="5400" w:hanging="360"/>
+      </w:pPr>
+      <w:rPr>
+        <w:rFonts w:ascii="Courier New" w:hAnsi="Courier New" w:cs="Courier New" w:hint="default"/>
+      </w:rPr>
+    </w:lvl>
+    <w:lvl w:ilvl="8" w:tplc="10090005" w:tentative="1">
+      <w:start w:val="1"/>
+      <w:numFmt w:val="bullet"/>
+      <w:lvlText w:val=""/>
+      <w:lvlJc w:val="left"/>
+      <w:pPr>
+        <w:ind w:left="6120" w:hanging="360"/>
+      </w:pPr>
+      <w:rPr>
+        <w:rFonts w:ascii="Wingdings" w:hAnsi="Wingdings" w:hint="default"/>
+      </w:rPr>
+    </w:lvl>
+  </w:abstractNum>
   <w:num w:numId="1" w16cid:durableId="158431040">
     <w:abstractNumId w:val="0"/>
+  </w:num>
+  <w:num w:numId="2" w16cid:durableId="764807480">
+    <w:abstractNumId w:val="1"/>
   </w:num>
 </w:numbering>
 </file>
@@ -1952,6 +2246,7 @@
   <w:style w:type="character" w:default="1" w:styleId="DefaultParagraphFont">
     <w:name w:val="Default Paragraph Font"/>
     <w:uiPriority w:val="1"/>
+    <w:semiHidden/>
     <w:unhideWhenUsed/>
   </w:style>
   <w:style w:type="table" w:default="1" w:styleId="TableNormal">

</xml_diff>

<commit_message>
Japan is missing 2020 Employment data (from the SUT file). it also has only 30 sectors
</commit_message>
<xml_diff>
--- a/Benchmarking/Benchmark List of graphs.docx
+++ b/Benchmarking/Benchmark List of graphs.docx
@@ -774,6 +774,7 @@
           <w:rFonts w:asciiTheme="majorBidi" w:hAnsiTheme="majorBidi" w:cstheme="majorBidi"/>
           <w:sz w:val="24"/>
           <w:szCs w:val="24"/>
+          <w:lang w:val="en-US"/>
         </w:rPr>
       </w:pPr>
     </w:p>
@@ -824,33 +825,6 @@
     <w:p>
       <w:pPr>
         <w:spacing w:after="0"/>
-        <w:ind w:left="720"/>
-        <w:rPr>
-          <w:rFonts w:asciiTheme="majorBidi" w:hAnsiTheme="majorBidi" w:cstheme="majorBidi"/>
-          <w:sz w:val="24"/>
-          <w:szCs w:val="24"/>
-          <w:rtl/>
-          <w:lang w:val="en-CA"/>
-        </w:rPr>
-      </w:pPr>
-    </w:p>
-    <w:p>
-      <w:pPr>
-        <w:spacing w:after="0"/>
-        <w:ind w:left="720"/>
-        <w:rPr>
-          <w:rFonts w:asciiTheme="majorBidi" w:hAnsiTheme="majorBidi" w:cstheme="majorBidi"/>
-          <w:sz w:val="24"/>
-          <w:szCs w:val="24"/>
-          <w:rtl/>
-          <w:lang w:val="en-CA"/>
-        </w:rPr>
-      </w:pPr>
-    </w:p>
-    <w:p>
-      <w:pPr>
-        <w:spacing w:after="0"/>
-        <w:ind w:left="720"/>
         <w:rPr>
           <w:rFonts w:asciiTheme="majorBidi" w:hAnsiTheme="majorBidi" w:cstheme="majorBidi"/>
           <w:sz w:val="24"/>
@@ -881,6 +855,14 @@
         </w:rPr>
         <w:t>2019 ICT Cross-Sector Diffusion Employment Impact Ratio</w:t>
       </w:r>
+      <w:r>
+        <w:rPr>
+          <w:rFonts w:asciiTheme="majorBidi" w:hAnsiTheme="majorBidi" w:cstheme="majorBidi"/>
+          <w:sz w:val="24"/>
+          <w:szCs w:val="24"/>
+        </w:rPr>
+        <w:t xml:space="preserve"> = forward linkage</w:t>
+      </w:r>
     </w:p>
     <w:p>
       <w:pPr>
@@ -974,6 +956,42 @@
         <w:t>ICT Employment Impact Ratio (Increase/decrease from 2010 to 2019)</w:t>
       </w:r>
       <w:bookmarkEnd w:id="4"/>
+    </w:p>
+    <w:p>
+      <w:pPr>
+        <w:spacing w:after="0"/>
+        <w:ind w:left="720"/>
+        <w:rPr>
+          <w:rFonts w:asciiTheme="majorBidi" w:hAnsiTheme="majorBidi" w:cstheme="majorBidi"/>
+          <w:sz w:val="24"/>
+          <w:szCs w:val="24"/>
+          <w:lang w:val="en-CA"/>
+        </w:rPr>
+      </w:pPr>
+    </w:p>
+    <w:p>
+      <w:pPr>
+        <w:spacing w:after="0"/>
+        <w:ind w:left="720"/>
+        <w:rPr>
+          <w:rFonts w:asciiTheme="majorBidi" w:hAnsiTheme="majorBidi" w:cstheme="majorBidi"/>
+          <w:sz w:val="24"/>
+          <w:szCs w:val="24"/>
+          <w:lang w:val="en-CA"/>
+        </w:rPr>
+      </w:pPr>
+    </w:p>
+    <w:p>
+      <w:pPr>
+        <w:spacing w:after="0"/>
+        <w:ind w:left="720"/>
+        <w:rPr>
+          <w:rFonts w:asciiTheme="majorBidi" w:hAnsiTheme="majorBidi" w:cstheme="majorBidi"/>
+          <w:sz w:val="24"/>
+          <w:szCs w:val="24"/>
+          <w:lang w:val="en-CA"/>
+        </w:rPr>
+      </w:pPr>
     </w:p>
     <w:p>
       <w:pPr>

</xml_diff>

<commit_message>
started A10_graphs1. checked CAN 2020 fother and it's ok, but I need to put the files in order. they are messy
</commit_message>
<xml_diff>
--- a/Benchmarking/Benchmark List of graphs.docx
+++ b/Benchmarking/Benchmark List of graphs.docx
@@ -1,7 +1,64 @@
 
 <file path=word/document.xml><?xml version="1.0" encoding="utf-8"?>
-<w:document xmlns:wpc="http://schemas.microsoft.com/office/word/2010/wordprocessingCanvas" xmlns:cx="http://schemas.microsoft.com/office/drawing/2014/chartex" xmlns:cx1="http://schemas.microsoft.com/office/drawing/2015/9/8/chartex" xmlns:cx2="http://schemas.microsoft.com/office/drawing/2015/10/21/chartex" xmlns:cx3="http://schemas.microsoft.com/office/drawing/2016/5/9/chartex" xmlns:cx4="http://schemas.microsoft.com/office/drawing/2016/5/10/chartex" xmlns:cx5="http://schemas.microsoft.com/office/drawing/2016/5/11/chartex" xmlns:cx6="http://schemas.microsoft.com/office/drawing/2016/5/12/chartex" xmlns:cx7="http://schemas.microsoft.com/office/drawing/2016/5/13/chartex" xmlns:cx8="http://schemas.microsoft.com/office/drawing/2016/5/14/chartex" xmlns:mc="http://schemas.openxmlformats.org/markup-compatibility/2006" xmlns:aink="http://schemas.microsoft.com/office/drawing/2016/ink" xmlns:am3d="http://schemas.microsoft.com/office/drawing/2017/model3d" xmlns:o="urn:schemas-microsoft-com:office:office" xmlns:oel="http://schemas.microsoft.com/office/2019/extlst" xmlns:r="http://schemas.openxmlformats.org/officeDocument/2006/relationships" xmlns:m="http://schemas.openxmlformats.org/officeDocument/2006/math" xmlns:v="urn:schemas-microsoft-com:vml" xmlns:wp14="http://schemas.microsoft.com/office/word/2010/wordprocessingDrawing" xmlns:wp="http://schemas.openxmlformats.org/drawingml/2006/wordprocessingDrawing" xmlns:w10="urn:schemas-microsoft-com:office:word" xmlns:w="http://schemas.openxmlformats.org/wordprocessingml/2006/main" xmlns:w14="http://schemas.microsoft.com/office/word/2010/wordml" xmlns:w15="http://schemas.microsoft.com/office/word/2012/wordml" xmlns:w16cex="http://schemas.microsoft.com/office/word/2018/wordml/cex" xmlns:w16cid="http://schemas.microsoft.com/office/word/2016/wordml/cid" xmlns:w16="http://schemas.microsoft.com/office/word/2018/wordml" xmlns:w16sdtdh="http://schemas.microsoft.com/office/word/2020/wordml/sdtdatahash" xmlns:w16se="http://schemas.microsoft.com/office/word/2015/wordml/symex" xmlns:wpg="http://schemas.microsoft.com/office/word/2010/wordprocessingGroup" xmlns:wpi="http://schemas.microsoft.com/office/word/2010/wordprocessingInk" xmlns:wne="http://schemas.microsoft.com/office/word/2006/wordml" xmlns:wps="http://schemas.microsoft.com/office/word/2010/wordprocessingShape" mc:Ignorable="w14 w15 w16se w16cid w16 w16cex w16sdtdh wp14">
+<w:document xmlns:wpc="http://schemas.microsoft.com/office/word/2010/wordprocessingCanvas" xmlns:cx="http://schemas.microsoft.com/office/drawing/2014/chartex" xmlns:cx1="http://schemas.microsoft.com/office/drawing/2015/9/8/chartex" xmlns:cx2="http://schemas.microsoft.com/office/drawing/2015/10/21/chartex" xmlns:cx3="http://schemas.microsoft.com/office/drawing/2016/5/9/chartex" xmlns:cx4="http://schemas.microsoft.com/office/drawing/2016/5/10/chartex" xmlns:cx5="http://schemas.microsoft.com/office/drawing/2016/5/11/chartex" xmlns:cx6="http://schemas.microsoft.com/office/drawing/2016/5/12/chartex" xmlns:cx7="http://schemas.microsoft.com/office/drawing/2016/5/13/chartex" xmlns:cx8="http://schemas.microsoft.com/office/drawing/2016/5/14/chartex" xmlns:mc="http://schemas.openxmlformats.org/markup-compatibility/2006" xmlns:aink="http://schemas.microsoft.com/office/drawing/2016/ink" xmlns:am3d="http://schemas.microsoft.com/office/drawing/2017/model3d" xmlns:o="urn:schemas-microsoft-com:office:office" xmlns:oel="http://schemas.microsoft.com/office/2019/extlst" xmlns:r="http://schemas.openxmlformats.org/officeDocument/2006/relationships" xmlns:m="http://schemas.openxmlformats.org/officeDocument/2006/math" xmlns:v="urn:schemas-microsoft-com:vml" xmlns:wp14="http://schemas.microsoft.com/office/word/2010/wordprocessingDrawing" xmlns:wp="http://schemas.openxmlformats.org/drawingml/2006/wordprocessingDrawing" xmlns:w10="urn:schemas-microsoft-com:office:word" xmlns:w="http://schemas.openxmlformats.org/wordprocessingml/2006/main" xmlns:w14="http://schemas.microsoft.com/office/word/2010/wordml" xmlns:w15="http://schemas.microsoft.com/office/word/2012/wordml" xmlns:w16cex="http://schemas.microsoft.com/office/word/2018/wordml/cex" xmlns:w16cid="http://schemas.microsoft.com/office/word/2016/wordml/cid" xmlns:w16="http://schemas.microsoft.com/office/word/2018/wordml" xmlns:w16du="http://schemas.microsoft.com/office/word/2023/wordml/word16du" xmlns:w16sdtdh="http://schemas.microsoft.com/office/word/2020/wordml/sdtdatahash" xmlns:w16sdtfl="http://schemas.microsoft.com/office/word/2024/wordml/sdtformatlock" xmlns:w16se="http://schemas.microsoft.com/office/word/2015/wordml/symex" xmlns:wpg="http://schemas.microsoft.com/office/word/2010/wordprocessingGroup" xmlns:wpi="http://schemas.microsoft.com/office/word/2010/wordprocessingInk" xmlns:wne="http://schemas.microsoft.com/office/word/2006/wordml" xmlns:wps="http://schemas.microsoft.com/office/word/2010/wordprocessingShape" mc:Ignorable="w14 w15 w16se w16cid w16 w16cex w16sdtdh w16sdtfl w16du wp14">
   <w:body>
+    <w:p>
+      <w:pPr>
+        <w:spacing w:after="0"/>
+      </w:pPr>
+    </w:p>
+    <w:p>
+      <w:pPr>
+        <w:spacing w:after="0"/>
+      </w:pPr>
+    </w:p>
+    <w:p>
+      <w:pPr>
+        <w:spacing w:after="0"/>
+      </w:pPr>
+      <w:r>
+        <w:t>Graphs directory</w:t>
+      </w:r>
+    </w:p>
+    <w:p>
+      <w:pPr>
+        <w:spacing w:after="0"/>
+      </w:pPr>
+      <w:r>
+        <w:t xml:space="preserve">My </w:t>
+      </w:r>
+      <w:proofErr w:type="spellStart"/>
+      <w:r>
+        <w:t>compuer</w:t>
+      </w:r>
+      <w:proofErr w:type="spellEnd"/>
+      <w:r>
+        <w:t>/ubuntu/home/</w:t>
+      </w:r>
+      <w:proofErr w:type="spellStart"/>
+      <w:r>
+        <w:t>orih</w:t>
+      </w:r>
+      <w:proofErr w:type="spellEnd"/>
+      <w:r>
+        <w:t>/</w:t>
+      </w:r>
+      <w:proofErr w:type="spellStart"/>
+      <w:r>
+        <w:t>python_graph_Navit</w:t>
+      </w:r>
+      <w:proofErr w:type="spellEnd"/>
+    </w:p>
+    <w:p>
+      <w:pPr>
+        <w:spacing w:after="0"/>
+      </w:pPr>
+    </w:p>
+    <w:p>
+      <w:pPr>
+        <w:spacing w:after="0"/>
+      </w:pPr>
+    </w:p>
     <w:p>
       <w:pPr>
         <w:spacing w:after="0"/>
@@ -1571,7 +1628,7 @@
 </file>
 
 <file path=word/numbering.xml><?xml version="1.0" encoding="utf-8"?>
-<w:numbering xmlns:wpc="http://schemas.microsoft.com/office/word/2010/wordprocessingCanvas" xmlns:cx="http://schemas.microsoft.com/office/drawing/2014/chartex" xmlns:cx1="http://schemas.microsoft.com/office/drawing/2015/9/8/chartex" xmlns:cx2="http://schemas.microsoft.com/office/drawing/2015/10/21/chartex" xmlns:cx3="http://schemas.microsoft.com/office/drawing/2016/5/9/chartex" xmlns:cx4="http://schemas.microsoft.com/office/drawing/2016/5/10/chartex" xmlns:cx5="http://schemas.microsoft.com/office/drawing/2016/5/11/chartex" xmlns:cx6="http://schemas.microsoft.com/office/drawing/2016/5/12/chartex" xmlns:cx7="http://schemas.microsoft.com/office/drawing/2016/5/13/chartex" xmlns:cx8="http://schemas.microsoft.com/office/drawing/2016/5/14/chartex" xmlns:mc="http://schemas.openxmlformats.org/markup-compatibility/2006" xmlns:aink="http://schemas.microsoft.com/office/drawing/2016/ink" xmlns:am3d="http://schemas.microsoft.com/office/drawing/2017/model3d" xmlns:o="urn:schemas-microsoft-com:office:office" xmlns:oel="http://schemas.microsoft.com/office/2019/extlst" xmlns:r="http://schemas.openxmlformats.org/officeDocument/2006/relationships" xmlns:m="http://schemas.openxmlformats.org/officeDocument/2006/math" xmlns:v="urn:schemas-microsoft-com:vml" xmlns:wp14="http://schemas.microsoft.com/office/word/2010/wordprocessingDrawing" xmlns:wp="http://schemas.openxmlformats.org/drawingml/2006/wordprocessingDrawing" xmlns:w10="urn:schemas-microsoft-com:office:word" xmlns:w="http://schemas.openxmlformats.org/wordprocessingml/2006/main" xmlns:w14="http://schemas.microsoft.com/office/word/2010/wordml" xmlns:w15="http://schemas.microsoft.com/office/word/2012/wordml" xmlns:w16cex="http://schemas.microsoft.com/office/word/2018/wordml/cex" xmlns:w16cid="http://schemas.microsoft.com/office/word/2016/wordml/cid" xmlns:w16="http://schemas.microsoft.com/office/word/2018/wordml" xmlns:w16sdtdh="http://schemas.microsoft.com/office/word/2020/wordml/sdtdatahash" xmlns:w16se="http://schemas.microsoft.com/office/word/2015/wordml/symex" xmlns:wpg="http://schemas.microsoft.com/office/word/2010/wordprocessingGroup" xmlns:wpi="http://schemas.microsoft.com/office/word/2010/wordprocessingInk" xmlns:wne="http://schemas.microsoft.com/office/word/2006/wordml" xmlns:wps="http://schemas.microsoft.com/office/word/2010/wordprocessingShape" mc:Ignorable="w14 w15 w16se w16cid w16 w16cex w16sdtdh wp14">
+<w:numbering xmlns:wpc="http://schemas.microsoft.com/office/word/2010/wordprocessingCanvas" xmlns:cx="http://schemas.microsoft.com/office/drawing/2014/chartex" xmlns:cx1="http://schemas.microsoft.com/office/drawing/2015/9/8/chartex" xmlns:cx2="http://schemas.microsoft.com/office/drawing/2015/10/21/chartex" xmlns:cx3="http://schemas.microsoft.com/office/drawing/2016/5/9/chartex" xmlns:cx4="http://schemas.microsoft.com/office/drawing/2016/5/10/chartex" xmlns:cx5="http://schemas.microsoft.com/office/drawing/2016/5/11/chartex" xmlns:cx6="http://schemas.microsoft.com/office/drawing/2016/5/12/chartex" xmlns:cx7="http://schemas.microsoft.com/office/drawing/2016/5/13/chartex" xmlns:cx8="http://schemas.microsoft.com/office/drawing/2016/5/14/chartex" xmlns:mc="http://schemas.openxmlformats.org/markup-compatibility/2006" xmlns:aink="http://schemas.microsoft.com/office/drawing/2016/ink" xmlns:am3d="http://schemas.microsoft.com/office/drawing/2017/model3d" xmlns:o="urn:schemas-microsoft-com:office:office" xmlns:oel="http://schemas.microsoft.com/office/2019/extlst" xmlns:r="http://schemas.openxmlformats.org/officeDocument/2006/relationships" xmlns:m="http://schemas.openxmlformats.org/officeDocument/2006/math" xmlns:v="urn:schemas-microsoft-com:vml" xmlns:wp14="http://schemas.microsoft.com/office/word/2010/wordprocessingDrawing" xmlns:wp="http://schemas.openxmlformats.org/drawingml/2006/wordprocessingDrawing" xmlns:w10="urn:schemas-microsoft-com:office:word" xmlns:w="http://schemas.openxmlformats.org/wordprocessingml/2006/main" xmlns:w14="http://schemas.microsoft.com/office/word/2010/wordml" xmlns:w15="http://schemas.microsoft.com/office/word/2012/wordml" xmlns:w16cex="http://schemas.microsoft.com/office/word/2018/wordml/cex" xmlns:w16cid="http://schemas.microsoft.com/office/word/2016/wordml/cid" xmlns:w16="http://schemas.microsoft.com/office/word/2018/wordml" xmlns:w16du="http://schemas.microsoft.com/office/word/2023/wordml/word16du" xmlns:w16sdtdh="http://schemas.microsoft.com/office/word/2020/wordml/sdtdatahash" xmlns:w16sdtfl="http://schemas.microsoft.com/office/word/2024/wordml/sdtformatlock" xmlns:w16se="http://schemas.microsoft.com/office/word/2015/wordml/symex" xmlns:wpg="http://schemas.microsoft.com/office/word/2010/wordprocessingGroup" xmlns:wpi="http://schemas.microsoft.com/office/word/2010/wordprocessingInk" xmlns:wne="http://schemas.microsoft.com/office/word/2006/wordml" xmlns:wps="http://schemas.microsoft.com/office/word/2010/wordprocessingShape" mc:Ignorable="w14 w15 w16se w16cid w16 w16cex w16sdtdh w16sdtfl w16du wp14">
   <w:abstractNum w:abstractNumId="0" w15:restartNumberingAfterBreak="0">
     <w:nsid w:val="30D109DE"/>
     <w:multiLevelType w:val="hybridMultilevel"/>
@@ -1781,7 +1838,7 @@
 </file>
 
 <file path=word/styles.xml><?xml version="1.0" encoding="utf-8"?>
-<w:styles xmlns:mc="http://schemas.openxmlformats.org/markup-compatibility/2006" xmlns:r="http://schemas.openxmlformats.org/officeDocument/2006/relationships" xmlns:w="http://schemas.openxmlformats.org/wordprocessingml/2006/main" xmlns:w14="http://schemas.microsoft.com/office/word/2010/wordml" xmlns:w15="http://schemas.microsoft.com/office/word/2012/wordml" xmlns:w16cex="http://schemas.microsoft.com/office/word/2018/wordml/cex" xmlns:w16cid="http://schemas.microsoft.com/office/word/2016/wordml/cid" xmlns:w16="http://schemas.microsoft.com/office/word/2018/wordml" xmlns:w16sdtdh="http://schemas.microsoft.com/office/word/2020/wordml/sdtdatahash" xmlns:w16se="http://schemas.microsoft.com/office/word/2015/wordml/symex" mc:Ignorable="w14 w15 w16se w16cid w16 w16cex w16sdtdh">
+<w:styles xmlns:mc="http://schemas.openxmlformats.org/markup-compatibility/2006" xmlns:r="http://schemas.openxmlformats.org/officeDocument/2006/relationships" xmlns:w="http://schemas.openxmlformats.org/wordprocessingml/2006/main" xmlns:w14="http://schemas.microsoft.com/office/word/2010/wordml" xmlns:w15="http://schemas.microsoft.com/office/word/2012/wordml" xmlns:w16cex="http://schemas.microsoft.com/office/word/2018/wordml/cex" xmlns:w16cid="http://schemas.microsoft.com/office/word/2016/wordml/cid" xmlns:w16="http://schemas.microsoft.com/office/word/2018/wordml" xmlns:w16du="http://schemas.microsoft.com/office/word/2023/wordml/word16du" xmlns:w16sdtdh="http://schemas.microsoft.com/office/word/2020/wordml/sdtdatahash" xmlns:w16sdtfl="http://schemas.microsoft.com/office/word/2024/wordml/sdtformatlock" xmlns:w16se="http://schemas.microsoft.com/office/word/2015/wordml/symex" mc:Ignorable="w14 w15 w16se w16cid w16 w16cex w16sdtdh w16sdtfl w16du">
   <w:docDefaults>
     <w:rPrDefault>
       <w:rPr>

</xml_diff>